<commit_message>
docs(poa): tandai dokumen koreksi POA dan pemeriksaan lapangan untuk ditinjau ulang
Kolom POA 2026 ternyata bercampur sensor GHI (WS-3, WS-4, WS-5, WS-1 s.d. Mei) dan POA
(WS-2, WS-1 sejak Jun). Keputusan 1-4 di ringkasan ditangguhkan, draf blok koreksi jangan
disalin ke config, daftar periksa WS-2/WS-1 diganti. Versi docx dibangun ulang.

Co-Authored-By: Claude Opus 5.5 <noreply@anthropic.com>
</commit_message>
<xml_diff>
--- a/docs/Pemeriksaan_Lapangan_WS1_WS2.docx
+++ b/docs/Pemeriksaan_Lapangan_WS1_WS2.docx
@@ -11,6 +11,173 @@
           <w:color w:val="1F3A5F"/>
         </w:rPr>
         <w:t>Pemeriksaan Lapangan Sensor POA WS-2 dan WS-1</w:t>
+      </w:r>
+    </w:p>
+    <w:p>
+      <w:r>
+        <w:rPr>
+          <w:b/>
+        </w:rPr>
+        <w:t>DITINJAU ULANG 14 Oktober 2026 — sebagian dasar di bawah gugur; pakai daftar pengganti ini.</w:t>
+      </w:r>
+    </w:p>
+    <w:p>
+      <w:r>
+        <w:rPr>
+          <w:b w:val="0"/>
+        </w:rPr>
+        <w:t xml:space="preserve">Kolom "POA" yang dianalisa ternyata bercampur jenis sensor: WS-3/WS-4/WS-5 dan WS-1 (Jan–Mei 2026) = </w:t>
+      </w:r>
+      <w:r>
+        <w:rPr>
+          <w:b/>
+        </w:rPr>
+        <w:t>GHI</w:t>
+      </w:r>
+      <w:r>
+        <w:rPr>
+          <w:b w:val="0"/>
+        </w:rPr>
+        <w:t xml:space="preserve"> (datar), WS-2 dan WS-1 (sejak Jun 2026) = </w:t>
+      </w:r>
+      <w:r>
+        <w:rPr>
+          <w:b/>
+        </w:rPr>
+        <w:t>POA</w:t>
+      </w:r>
+      <w:r>
+        <w:rPr>
+          <w:b w:val="0"/>
+        </w:rPr>
+        <w:t xml:space="preserve"> (miring). Karena itu:</w:t>
+      </w:r>
+    </w:p>
+    <w:p>
+      <w:pPr>
+        <w:pStyle w:val="ListBullet"/>
+      </w:pPr>
+      <w:r>
+        <w:rPr>
+          <w:b/>
+        </w:rPr>
+        <w:t>WS-2 "+8–14 % sejak kembali Jun" dan "miring ~26°" gugur.</w:t>
+      </w:r>
+      <w:r>
+        <w:rPr>
+          <w:b w:val="0"/>
+        </w:rPr>
+        <w:t xml:space="preserve"> Selisih itu terutama efek kemiringan POA terhadap acuan GHI. Di WS-2 sendiri POA/GHI siang cerah 1,056 Jul, 1,040 Agu, 0,999 Sep (teori miring 10° utara: 1,046 / 1,026 / 0,998).</w:t>
+      </w:r>
+    </w:p>
+    <w:p>
+      <w:pPr>
+        <w:pStyle w:val="ListBullet"/>
+      </w:pPr>
+      <w:r>
+        <w:rPr>
+          <w:b/>
+        </w:rPr>
+        <w:t>Yang tetap perlu diperiksa di WS-2:</w:t>
+      </w:r>
+      <w:r>
+        <w:rPr>
+          <w:b w:val="0"/>
+        </w:rPr>
+        <w:t xml:space="preserve"> dalam energi harian, POA WS-2 membaca </w:t>
+      </w:r>
+      <w:r>
+        <w:rPr>
+          <w:b/>
+        </w:rPr>
+        <w:t>+6–7 %</w:t>
+      </w:r>
+      <w:r>
+        <w:rPr>
+          <w:b w:val="0"/>
+        </w:rPr>
+        <w:t xml:space="preserve"> di atas GHI WS-2 yang ditransposisi (Jun–Agu; +2,7 % Sep). Catat nomor seri dan konstanta sensitivitas </w:t>
+      </w:r>
+      <w:r>
+        <w:rPr>
+          <w:b/>
+        </w:rPr>
+        <w:t>kedua</w:t>
+      </w:r>
+      <w:r>
+        <w:rPr>
+          <w:b w:val="0"/>
+        </w:rPr>
+        <w:t xml:space="preserve"> sensor (POA dan GHI), serta kemiringan dan arah sensor POA (harapan 10°, utara).</w:t>
+      </w:r>
+    </w:p>
+    <w:p>
+      <w:pPr>
+        <w:pStyle w:val="ListBullet"/>
+      </w:pPr>
+      <w:r>
+        <w:rPr>
+          <w:b/>
+        </w:rPr>
+        <w:t>WS-1 "bayangan baru sejak Juni" adalah pergantian sumber.</w:t>
+      </w:r>
+      <w:r>
+        <w:rPr>
+          <w:b w:val="0"/>
+        </w:rPr>
+        <w:t xml:space="preserve"> Sampai Mei kolom WS-1 berisi GHI; sejak Juni berisi POA, dan sensor POA itu terbayangi ±11:20–12:50. Benda di atas/utara sensor POA tetap diperiksa; pertanyaan "kapan benda dipasang (1–10 Jun)" tidak berlaku lagi.</w:t>
+      </w:r>
+    </w:p>
+    <w:p>
+      <w:pPr>
+        <w:pStyle w:val="ListBullet"/>
+      </w:pPr>
+      <w:r>
+        <w:rPr>
+          <w:b/>
+        </w:rPr>
+        <w:t>Pertanyaan baru ke tim SCADA:</w:t>
+      </w:r>
+      <w:r>
+        <w:rPr>
+          <w:b w:val="0"/>
+        </w:rPr>
+        <w:t xml:space="preserve"> WS-3 POA tidak pernah berisi data Des 2025–Sep 2026; WS-4 POA berhenti awal Jan 2026 (Des 2025 masih penuh); WS-1 POA kosong Des 2025–Mei 2026; WS-2 seluruh stasiun kosong Mar–Mei 2026. Apakah sensor POA WS-3/WS-4 terpasang dan tag-nya terkonfigurasi?</w:t>
+      </w:r>
+    </w:p>
+    <w:p>
+      <w:pPr>
+        <w:pStyle w:val="ListBullet"/>
+      </w:pPr>
+      <w:r>
+        <w:rPr>
+          <w:b w:val="0"/>
+        </w:rPr>
+        <w:t>Bagian 3 (</w:t>
+      </w:r>
+      <w:r>
+        <w:rPr>
+          <w:b/>
+        </w:rPr>
+        <w:t>WS-3 naik ~6 % sekitar 10 Agu 2026</w:t>
+      </w:r>
+      <w:r>
+        <w:rPr>
+          <w:b w:val="0"/>
+        </w:rPr>
+        <w:t xml:space="preserve">) tetap berlaku, sebagai perubahan pada sensor </w:t>
+      </w:r>
+      <w:r>
+        <w:rPr>
+          <w:b/>
+        </w:rPr>
+        <w:t>GHI</w:t>
+      </w:r>
+      <w:r>
+        <w:rPr>
+          <w:b w:val="0"/>
+        </w:rPr>
+        <w:t xml:space="preserve"> WS-3.</w:t>
       </w:r>
     </w:p>
     <w:p>

</xml_diff>